<commit_message>
Adding all the documentation of the project here
</commit_message>
<xml_diff>
--- a/documents/DB Schema and table structures.docx
+++ b/documents/DB Schema and table structures.docx
@@ -2481,8 +2481,9 @@
     <w:tbl>
       <w:tblPr>
         <w:tblStyle w:val="Table4"/>
-        <w:tblW w:w="9360.0" w:type="dxa"/>
+        <w:tblW w:w="9390.0" w:type="dxa"/>
         <w:jc w:val="left"/>
+        <w:tblInd w:w="-15.0" w:type="dxa"/>
         <w:tblBorders>
           <w:top w:color="000000" w:space="0" w:sz="0" w:val="nil"/>
           <w:left w:color="000000" w:space="0" w:sz="0" w:val="nil"/>
@@ -2495,16 +2496,16 @@
         <w:tblLook w:val="0600"/>
       </w:tblPr>
       <w:tblGrid>
-        <w:gridCol w:w="2472.1757322175736"/>
-        <w:gridCol w:w="1914.1004184100418"/>
-        <w:gridCol w:w="1825.9832635983264"/>
-        <w:gridCol w:w="3147.7405857740587"/>
+        <w:gridCol w:w="2490"/>
+        <w:gridCol w:w="1920"/>
+        <w:gridCol w:w="1830"/>
+        <w:gridCol w:w="3150"/>
         <w:tblGridChange w:id="0">
           <w:tblGrid>
-            <w:gridCol w:w="2472.1757322175736"/>
-            <w:gridCol w:w="1914.1004184100418"/>
-            <w:gridCol w:w="1825.9832635983264"/>
-            <w:gridCol w:w="3147.7405857740587"/>
+            <w:gridCol w:w="2490"/>
+            <w:gridCol w:w="1920"/>
+            <w:gridCol w:w="1830"/>
+            <w:gridCol w:w="3150"/>
           </w:tblGrid>
         </w:tblGridChange>
       </w:tblGrid>
@@ -3328,65 +3329,62 @@
               <w:rPr>
                 <w:rtl w:val="0"/>
               </w:rPr>
-              <w:t xml:space="preserve">Father_name no</w:t>
-            </w:r>
-          </w:p>
-        </w:tc>
-        <w:tc>
-          <w:tcPr>
-            <w:tcBorders>
-              <w:top w:color="000000" w:space="0" w:sz="6" w:val="single"/>
-              <w:left w:color="000000" w:space="0" w:sz="6" w:val="single"/>
-              <w:bottom w:color="000000" w:space="0" w:sz="6" w:val="single"/>
-              <w:right w:color="000000" w:space="0" w:sz="6" w:val="single"/>
-            </w:tcBorders>
-            <w:tcMar>
-              <w:top w:w="100.0" w:type="dxa"/>
-              <w:left w:w="100.0" w:type="dxa"/>
-              <w:bottom w:w="100.0" w:type="dxa"/>
-              <w:right w:w="100.0" w:type="dxa"/>
-            </w:tcMar>
-            <w:vAlign w:val="top"/>
-          </w:tcPr>
-          <w:p>
-            <w:pPr>
-              <w:spacing w:after="480" w:lineRule="auto"/>
-              <w:rPr/>
-            </w:pPr>
-            <w:r>
-              <w:rPr>
-                <w:rtl w:val="0"/>
-              </w:rPr>
-              <w:t xml:space="preserve">VARCHAR</w:t>
-            </w:r>
-          </w:p>
-        </w:tc>
-        <w:tc>
-          <w:tcPr>
-            <w:tcBorders>
-              <w:top w:color="000000" w:space="0" w:sz="6" w:val="single"/>
-              <w:left w:color="000000" w:space="0" w:sz="6" w:val="single"/>
-              <w:bottom w:color="000000" w:space="0" w:sz="6" w:val="single"/>
-              <w:right w:color="000000" w:space="0" w:sz="6" w:val="single"/>
-            </w:tcBorders>
-            <w:tcMar>
-              <w:top w:w="100.0" w:type="dxa"/>
-              <w:left w:w="100.0" w:type="dxa"/>
-              <w:bottom w:w="100.0" w:type="dxa"/>
-              <w:right w:w="100.0" w:type="dxa"/>
-            </w:tcMar>
-            <w:vAlign w:val="top"/>
-          </w:tcPr>
-          <w:p>
-            <w:pPr>
-              <w:spacing w:after="480" w:lineRule="auto"/>
-              <w:rPr/>
-            </w:pPr>
-            <w:r>
-              <w:rPr>
-                <w:rtl w:val="0"/>
-              </w:rPr>
-              <w:t xml:space="preserve">Not Null</w:t>
+            </w:r>
+          </w:p>
+        </w:tc>
+        <w:tc>
+          <w:tcPr>
+            <w:tcBorders>
+              <w:top w:color="000000" w:space="0" w:sz="6" w:val="single"/>
+              <w:left w:color="000000" w:space="0" w:sz="6" w:val="single"/>
+              <w:bottom w:color="000000" w:space="0" w:sz="6" w:val="single"/>
+              <w:right w:color="000000" w:space="0" w:sz="6" w:val="single"/>
+            </w:tcBorders>
+            <w:tcMar>
+              <w:top w:w="100.0" w:type="dxa"/>
+              <w:left w:w="100.0" w:type="dxa"/>
+              <w:bottom w:w="100.0" w:type="dxa"/>
+              <w:right w:w="100.0" w:type="dxa"/>
+            </w:tcMar>
+            <w:vAlign w:val="top"/>
+          </w:tcPr>
+          <w:p>
+            <w:pPr>
+              <w:spacing w:after="480" w:lineRule="auto"/>
+              <w:rPr/>
+            </w:pPr>
+            <w:r>
+              <w:rPr>
+                <w:rtl w:val="0"/>
+              </w:rPr>
+            </w:r>
+          </w:p>
+        </w:tc>
+        <w:tc>
+          <w:tcPr>
+            <w:tcBorders>
+              <w:top w:color="000000" w:space="0" w:sz="6" w:val="single"/>
+              <w:left w:color="000000" w:space="0" w:sz="6" w:val="single"/>
+              <w:bottom w:color="000000" w:space="0" w:sz="6" w:val="single"/>
+              <w:right w:color="000000" w:space="0" w:sz="6" w:val="single"/>
+            </w:tcBorders>
+            <w:tcMar>
+              <w:top w:w="100.0" w:type="dxa"/>
+              <w:left w:w="100.0" w:type="dxa"/>
+              <w:bottom w:w="100.0" w:type="dxa"/>
+              <w:right w:w="100.0" w:type="dxa"/>
+            </w:tcMar>
+            <w:vAlign w:val="top"/>
+          </w:tcPr>
+          <w:p>
+            <w:pPr>
+              <w:spacing w:after="480" w:lineRule="auto"/>
+              <w:rPr/>
+            </w:pPr>
+            <w:r>
+              <w:rPr>
+                <w:rtl w:val="0"/>
+              </w:rPr>
             </w:r>
           </w:p>
         </w:tc>
@@ -3450,65 +3448,62 @@
               <w:rPr>
                 <w:rtl w:val="0"/>
               </w:rPr>
-              <w:t xml:space="preserve">Mother_name no</w:t>
-            </w:r>
-          </w:p>
-        </w:tc>
-        <w:tc>
-          <w:tcPr>
-            <w:tcBorders>
-              <w:top w:color="000000" w:space="0" w:sz="6" w:val="single"/>
-              <w:left w:color="000000" w:space="0" w:sz="6" w:val="single"/>
-              <w:bottom w:color="000000" w:space="0" w:sz="6" w:val="single"/>
-              <w:right w:color="000000" w:space="0" w:sz="6" w:val="single"/>
-            </w:tcBorders>
-            <w:tcMar>
-              <w:top w:w="100.0" w:type="dxa"/>
-              <w:left w:w="100.0" w:type="dxa"/>
-              <w:bottom w:w="100.0" w:type="dxa"/>
-              <w:right w:w="100.0" w:type="dxa"/>
-            </w:tcMar>
-            <w:vAlign w:val="top"/>
-          </w:tcPr>
-          <w:p>
-            <w:pPr>
-              <w:spacing w:after="480" w:lineRule="auto"/>
-              <w:rPr/>
-            </w:pPr>
-            <w:r>
-              <w:rPr>
-                <w:rtl w:val="0"/>
-              </w:rPr>
-              <w:t xml:space="preserve">VARCHAR</w:t>
-            </w:r>
-          </w:p>
-        </w:tc>
-        <w:tc>
-          <w:tcPr>
-            <w:tcBorders>
-              <w:top w:color="000000" w:space="0" w:sz="6" w:val="single"/>
-              <w:left w:color="000000" w:space="0" w:sz="6" w:val="single"/>
-              <w:bottom w:color="000000" w:space="0" w:sz="6" w:val="single"/>
-              <w:right w:color="000000" w:space="0" w:sz="6" w:val="single"/>
-            </w:tcBorders>
-            <w:tcMar>
-              <w:top w:w="100.0" w:type="dxa"/>
-              <w:left w:w="100.0" w:type="dxa"/>
-              <w:bottom w:w="100.0" w:type="dxa"/>
-              <w:right w:w="100.0" w:type="dxa"/>
-            </w:tcMar>
-            <w:vAlign w:val="top"/>
-          </w:tcPr>
-          <w:p>
-            <w:pPr>
-              <w:spacing w:after="480" w:lineRule="auto"/>
-              <w:rPr/>
-            </w:pPr>
-            <w:r>
-              <w:rPr>
-                <w:rtl w:val="0"/>
-              </w:rPr>
-              <w:t xml:space="preserve">Not Null</w:t>
+            </w:r>
+          </w:p>
+        </w:tc>
+        <w:tc>
+          <w:tcPr>
+            <w:tcBorders>
+              <w:top w:color="000000" w:space="0" w:sz="6" w:val="single"/>
+              <w:left w:color="000000" w:space="0" w:sz="6" w:val="single"/>
+              <w:bottom w:color="000000" w:space="0" w:sz="6" w:val="single"/>
+              <w:right w:color="000000" w:space="0" w:sz="6" w:val="single"/>
+            </w:tcBorders>
+            <w:tcMar>
+              <w:top w:w="100.0" w:type="dxa"/>
+              <w:left w:w="100.0" w:type="dxa"/>
+              <w:bottom w:w="100.0" w:type="dxa"/>
+              <w:right w:w="100.0" w:type="dxa"/>
+            </w:tcMar>
+            <w:vAlign w:val="top"/>
+          </w:tcPr>
+          <w:p>
+            <w:pPr>
+              <w:spacing w:after="480" w:lineRule="auto"/>
+              <w:rPr/>
+            </w:pPr>
+            <w:r>
+              <w:rPr>
+                <w:rtl w:val="0"/>
+              </w:rPr>
+            </w:r>
+          </w:p>
+        </w:tc>
+        <w:tc>
+          <w:tcPr>
+            <w:tcBorders>
+              <w:top w:color="000000" w:space="0" w:sz="6" w:val="single"/>
+              <w:left w:color="000000" w:space="0" w:sz="6" w:val="single"/>
+              <w:bottom w:color="000000" w:space="0" w:sz="6" w:val="single"/>
+              <w:right w:color="000000" w:space="0" w:sz="6" w:val="single"/>
+            </w:tcBorders>
+            <w:tcMar>
+              <w:top w:w="100.0" w:type="dxa"/>
+              <w:left w:w="100.0" w:type="dxa"/>
+              <w:bottom w:w="100.0" w:type="dxa"/>
+              <w:right w:w="100.0" w:type="dxa"/>
+            </w:tcMar>
+            <w:vAlign w:val="top"/>
+          </w:tcPr>
+          <w:p>
+            <w:pPr>
+              <w:spacing w:after="480" w:lineRule="auto"/>
+              <w:rPr/>
+            </w:pPr>
+            <w:r>
+              <w:rPr>
+                <w:rtl w:val="0"/>
+              </w:rPr>
             </w:r>
           </w:p>
         </w:tc>
@@ -3817,93 +3812,90 @@
               <w:rPr>
                 <w:rtl w:val="0"/>
               </w:rPr>
-              <w:t xml:space="preserve">Secondary_phone no</w:t>
-            </w:r>
-          </w:p>
-        </w:tc>
-        <w:tc>
-          <w:tcPr>
-            <w:tcBorders>
-              <w:top w:color="000000" w:space="0" w:sz="6" w:val="single"/>
-              <w:left w:color="000000" w:space="0" w:sz="6" w:val="single"/>
-              <w:bottom w:color="000000" w:space="0" w:sz="6" w:val="single"/>
-              <w:right w:color="000000" w:space="0" w:sz="6" w:val="single"/>
-            </w:tcBorders>
-            <w:tcMar>
-              <w:top w:w="100.0" w:type="dxa"/>
-              <w:left w:w="100.0" w:type="dxa"/>
-              <w:bottom w:w="100.0" w:type="dxa"/>
-              <w:right w:w="100.0" w:type="dxa"/>
-            </w:tcMar>
-            <w:vAlign w:val="top"/>
-          </w:tcPr>
-          <w:p>
-            <w:pPr>
-              <w:spacing w:after="480" w:lineRule="auto"/>
-              <w:rPr/>
-            </w:pPr>
-            <w:r>
-              <w:rPr>
-                <w:rtl w:val="0"/>
-              </w:rPr>
-              <w:t xml:space="preserve">VARCHAR</w:t>
-            </w:r>
-          </w:p>
-        </w:tc>
-        <w:tc>
-          <w:tcPr>
-            <w:tcBorders>
-              <w:top w:color="000000" w:space="0" w:sz="6" w:val="single"/>
-              <w:left w:color="000000" w:space="0" w:sz="6" w:val="single"/>
-              <w:bottom w:color="000000" w:space="0" w:sz="6" w:val="single"/>
-              <w:right w:color="000000" w:space="0" w:sz="6" w:val="single"/>
-            </w:tcBorders>
-            <w:tcMar>
-              <w:top w:w="100.0" w:type="dxa"/>
-              <w:left w:w="100.0" w:type="dxa"/>
-              <w:bottom w:w="100.0" w:type="dxa"/>
-              <w:right w:w="100.0" w:type="dxa"/>
-            </w:tcMar>
-            <w:vAlign w:val="top"/>
-          </w:tcPr>
-          <w:p>
-            <w:pPr>
-              <w:spacing w:after="480" w:lineRule="auto"/>
-              <w:rPr/>
-            </w:pPr>
-            <w:r>
-              <w:rPr>
-                <w:rtl w:val="0"/>
-              </w:rPr>
-            </w:r>
-          </w:p>
-        </w:tc>
-        <w:tc>
-          <w:tcPr>
-            <w:tcBorders>
-              <w:top w:color="000000" w:space="0" w:sz="6" w:val="single"/>
-              <w:left w:color="000000" w:space="0" w:sz="6" w:val="single"/>
-              <w:bottom w:color="000000" w:space="0" w:sz="6" w:val="single"/>
-              <w:right w:color="000000" w:space="0" w:sz="6" w:val="single"/>
-            </w:tcBorders>
-            <w:tcMar>
-              <w:top w:w="100.0" w:type="dxa"/>
-              <w:left w:w="100.0" w:type="dxa"/>
-              <w:bottom w:w="100.0" w:type="dxa"/>
-              <w:right w:w="100.0" w:type="dxa"/>
-            </w:tcMar>
-            <w:vAlign w:val="top"/>
-          </w:tcPr>
-          <w:p>
-            <w:pPr>
-              <w:spacing w:after="480" w:lineRule="auto"/>
-              <w:rPr/>
-            </w:pPr>
-            <w:r>
-              <w:rPr>
-                <w:rtl w:val="0"/>
-              </w:rPr>
-              <w:t xml:space="preserve">Optional.</w:t>
+            </w:r>
+          </w:p>
+        </w:tc>
+        <w:tc>
+          <w:tcPr>
+            <w:tcBorders>
+              <w:top w:color="000000" w:space="0" w:sz="6" w:val="single"/>
+              <w:left w:color="000000" w:space="0" w:sz="6" w:val="single"/>
+              <w:bottom w:color="000000" w:space="0" w:sz="6" w:val="single"/>
+              <w:right w:color="000000" w:space="0" w:sz="6" w:val="single"/>
+            </w:tcBorders>
+            <w:tcMar>
+              <w:top w:w="100.0" w:type="dxa"/>
+              <w:left w:w="100.0" w:type="dxa"/>
+              <w:bottom w:w="100.0" w:type="dxa"/>
+              <w:right w:w="100.0" w:type="dxa"/>
+            </w:tcMar>
+            <w:vAlign w:val="top"/>
+          </w:tcPr>
+          <w:p>
+            <w:pPr>
+              <w:spacing w:after="480" w:lineRule="auto"/>
+              <w:rPr/>
+            </w:pPr>
+            <w:r>
+              <w:rPr>
+                <w:rtl w:val="0"/>
+              </w:rPr>
+            </w:r>
+          </w:p>
+        </w:tc>
+        <w:tc>
+          <w:tcPr>
+            <w:tcBorders>
+              <w:top w:color="000000" w:space="0" w:sz="6" w:val="single"/>
+              <w:left w:color="000000" w:space="0" w:sz="6" w:val="single"/>
+              <w:bottom w:color="000000" w:space="0" w:sz="6" w:val="single"/>
+              <w:right w:color="000000" w:space="0" w:sz="6" w:val="single"/>
+            </w:tcBorders>
+            <w:tcMar>
+              <w:top w:w="100.0" w:type="dxa"/>
+              <w:left w:w="100.0" w:type="dxa"/>
+              <w:bottom w:w="100.0" w:type="dxa"/>
+              <w:right w:w="100.0" w:type="dxa"/>
+            </w:tcMar>
+            <w:vAlign w:val="top"/>
+          </w:tcPr>
+          <w:p>
+            <w:pPr>
+              <w:spacing w:after="480" w:lineRule="auto"/>
+              <w:rPr/>
+            </w:pPr>
+            <w:r>
+              <w:rPr>
+                <w:rtl w:val="0"/>
+              </w:rPr>
+            </w:r>
+          </w:p>
+        </w:tc>
+        <w:tc>
+          <w:tcPr>
+            <w:tcBorders>
+              <w:top w:color="000000" w:space="0" w:sz="6" w:val="single"/>
+              <w:left w:color="000000" w:space="0" w:sz="6" w:val="single"/>
+              <w:bottom w:color="000000" w:space="0" w:sz="6" w:val="single"/>
+              <w:right w:color="000000" w:space="0" w:sz="6" w:val="single"/>
+            </w:tcBorders>
+            <w:tcMar>
+              <w:top w:w="100.0" w:type="dxa"/>
+              <w:left w:w="100.0" w:type="dxa"/>
+              <w:bottom w:w="100.0" w:type="dxa"/>
+              <w:right w:w="100.0" w:type="dxa"/>
+            </w:tcMar>
+            <w:vAlign w:val="top"/>
+          </w:tcPr>
+          <w:p>
+            <w:pPr>
+              <w:spacing w:after="480" w:lineRule="auto"/>
+              <w:rPr/>
+            </w:pPr>
+            <w:r>
+              <w:rPr>
+                <w:rtl w:val="0"/>
+              </w:rPr>
             </w:r>
           </w:p>
         </w:tc>
@@ -3939,94 +3931,90 @@
               <w:rPr>
                 <w:rtl w:val="0"/>
               </w:rPr>
-              <w:t xml:space="preserve">Parents_phone no</w:t>
-            </w:r>
-          </w:p>
-        </w:tc>
-        <w:tc>
-          <w:tcPr>
-            <w:tcBorders>
-              <w:top w:color="000000" w:space="0" w:sz="6" w:val="single"/>
-              <w:left w:color="000000" w:space="0" w:sz="6" w:val="single"/>
-              <w:bottom w:color="000000" w:space="0" w:sz="6" w:val="single"/>
-              <w:right w:color="000000" w:space="0" w:sz="6" w:val="single"/>
-            </w:tcBorders>
-            <w:tcMar>
-              <w:top w:w="100.0" w:type="dxa"/>
-              <w:left w:w="100.0" w:type="dxa"/>
-              <w:bottom w:w="100.0" w:type="dxa"/>
-              <w:right w:w="100.0" w:type="dxa"/>
-            </w:tcMar>
-            <w:vAlign w:val="top"/>
-          </w:tcPr>
-          <w:p>
-            <w:pPr>
-              <w:spacing w:after="480" w:lineRule="auto"/>
-              <w:rPr/>
-            </w:pPr>
-            <w:r>
-              <w:rPr>
-                <w:rtl w:val="0"/>
-              </w:rPr>
-              <w:t xml:space="preserve">VARCHAR</w:t>
-            </w:r>
-          </w:p>
-        </w:tc>
-        <w:tc>
-          <w:tcPr>
-            <w:tcBorders>
-              <w:top w:color="000000" w:space="0" w:sz="6" w:val="single"/>
-              <w:left w:color="000000" w:space="0" w:sz="6" w:val="single"/>
-              <w:bottom w:color="000000" w:space="0" w:sz="6" w:val="single"/>
-              <w:right w:color="000000" w:space="0" w:sz="6" w:val="single"/>
-            </w:tcBorders>
-            <w:tcMar>
-              <w:top w:w="100.0" w:type="dxa"/>
-              <w:left w:w="100.0" w:type="dxa"/>
-              <w:bottom w:w="100.0" w:type="dxa"/>
-              <w:right w:w="100.0" w:type="dxa"/>
-            </w:tcMar>
-            <w:vAlign w:val="top"/>
-          </w:tcPr>
-          <w:p>
-            <w:pPr>
-              <w:spacing w:after="480" w:lineRule="auto"/>
-              <w:rPr/>
-            </w:pPr>
-            <w:r>
-              <w:rPr>
-                <w:rtl w:val="0"/>
-              </w:rPr>
-              <w:t xml:space="preserve">Not Null</w:t>
-            </w:r>
-          </w:p>
-        </w:tc>
-        <w:tc>
-          <w:tcPr>
-            <w:tcBorders>
-              <w:top w:color="000000" w:space="0" w:sz="6" w:val="single"/>
-              <w:left w:color="000000" w:space="0" w:sz="6" w:val="single"/>
-              <w:bottom w:color="000000" w:space="0" w:sz="6" w:val="single"/>
-              <w:right w:color="000000" w:space="0" w:sz="6" w:val="single"/>
-            </w:tcBorders>
-            <w:tcMar>
-              <w:top w:w="100.0" w:type="dxa"/>
-              <w:left w:w="100.0" w:type="dxa"/>
-              <w:bottom w:w="100.0" w:type="dxa"/>
-              <w:right w:w="100.0" w:type="dxa"/>
-            </w:tcMar>
-            <w:vAlign w:val="top"/>
-          </w:tcPr>
-          <w:p>
-            <w:pPr>
-              <w:spacing w:after="480" w:lineRule="auto"/>
-              <w:rPr/>
-            </w:pPr>
-            <w:r>
-              <w:rPr>
-                <w:rtl w:val="0"/>
-              </w:rPr>
-              <w:t xml:space="preserve">Emergency/Parent contact.</w:t>
+            </w:r>
+          </w:p>
+        </w:tc>
+        <w:tc>
+          <w:tcPr>
+            <w:tcBorders>
+              <w:top w:color="000000" w:space="0" w:sz="6" w:val="single"/>
+              <w:left w:color="000000" w:space="0" w:sz="6" w:val="single"/>
+              <w:bottom w:color="000000" w:space="0" w:sz="6" w:val="single"/>
+              <w:right w:color="000000" w:space="0" w:sz="6" w:val="single"/>
+            </w:tcBorders>
+            <w:tcMar>
+              <w:top w:w="100.0" w:type="dxa"/>
+              <w:left w:w="100.0" w:type="dxa"/>
+              <w:bottom w:w="100.0" w:type="dxa"/>
+              <w:right w:w="100.0" w:type="dxa"/>
+            </w:tcMar>
+            <w:vAlign w:val="top"/>
+          </w:tcPr>
+          <w:p>
+            <w:pPr>
+              <w:spacing w:after="480" w:lineRule="auto"/>
+              <w:rPr/>
+            </w:pPr>
+            <w:r>
+              <w:rPr>
+                <w:rtl w:val="0"/>
+              </w:rPr>
+            </w:r>
+          </w:p>
+        </w:tc>
+        <w:tc>
+          <w:tcPr>
+            <w:tcBorders>
+              <w:top w:color="000000" w:space="0" w:sz="6" w:val="single"/>
+              <w:left w:color="000000" w:space="0" w:sz="6" w:val="single"/>
+              <w:bottom w:color="000000" w:space="0" w:sz="6" w:val="single"/>
+              <w:right w:color="000000" w:space="0" w:sz="6" w:val="single"/>
+            </w:tcBorders>
+            <w:tcMar>
+              <w:top w:w="100.0" w:type="dxa"/>
+              <w:left w:w="100.0" w:type="dxa"/>
+              <w:bottom w:w="100.0" w:type="dxa"/>
+              <w:right w:w="100.0" w:type="dxa"/>
+            </w:tcMar>
+            <w:vAlign w:val="top"/>
+          </w:tcPr>
+          <w:p>
+            <w:pPr>
+              <w:spacing w:after="480" w:lineRule="auto"/>
+              <w:rPr/>
+            </w:pPr>
+            <w:r>
+              <w:rPr>
+                <w:rtl w:val="0"/>
+              </w:rPr>
+            </w:r>
+          </w:p>
+        </w:tc>
+        <w:tc>
+          <w:tcPr>
+            <w:tcBorders>
+              <w:top w:color="000000" w:space="0" w:sz="6" w:val="single"/>
+              <w:left w:color="000000" w:space="0" w:sz="6" w:val="single"/>
+              <w:bottom w:color="000000" w:space="0" w:sz="6" w:val="single"/>
+              <w:right w:color="000000" w:space="0" w:sz="6" w:val="single"/>
+            </w:tcBorders>
+            <w:tcMar>
+              <w:top w:w="100.0" w:type="dxa"/>
+              <w:left w:w="100.0" w:type="dxa"/>
+              <w:bottom w:w="100.0" w:type="dxa"/>
+              <w:right w:w="100.0" w:type="dxa"/>
+            </w:tcMar>
+            <w:vAlign w:val="top"/>
+          </w:tcPr>
+          <w:p>
+            <w:pPr>
+              <w:spacing w:after="480" w:lineRule="auto"/>
+              <w:rPr/>
+            </w:pPr>
+            <w:r>
+              <w:rPr>
+                <w:rtl w:val="0"/>
+              </w:rPr>
             </w:r>
           </w:p>
         </w:tc>
@@ -4429,94 +4417,90 @@
               <w:rPr>
                 <w:rtl w:val="0"/>
               </w:rPr>
-              <w:t xml:space="preserve">Base_monthly_salary </w:t>
-            </w:r>
-          </w:p>
-        </w:tc>
-        <w:tc>
-          <w:tcPr>
-            <w:tcBorders>
-              <w:top w:color="000000" w:space="0" w:sz="6" w:val="single"/>
-              <w:left w:color="000000" w:space="0" w:sz="6" w:val="single"/>
-              <w:bottom w:color="000000" w:space="0" w:sz="6" w:val="single"/>
-              <w:right w:color="000000" w:space="0" w:sz="6" w:val="single"/>
-            </w:tcBorders>
-            <w:tcMar>
-              <w:top w:w="100.0" w:type="dxa"/>
-              <w:left w:w="100.0" w:type="dxa"/>
-              <w:bottom w:w="100.0" w:type="dxa"/>
-              <w:right w:w="100.0" w:type="dxa"/>
-            </w:tcMar>
-            <w:vAlign w:val="top"/>
-          </w:tcPr>
-          <w:p>
-            <w:pPr>
-              <w:spacing w:after="480" w:lineRule="auto"/>
-              <w:rPr/>
-            </w:pPr>
-            <w:r>
-              <w:rPr>
-                <w:rtl w:val="0"/>
-              </w:rPr>
-              <w:t xml:space="preserve">DECIMAL(10,2)</w:t>
-            </w:r>
-          </w:p>
-        </w:tc>
-        <w:tc>
-          <w:tcPr>
-            <w:tcBorders>
-              <w:top w:color="000000" w:space="0" w:sz="6" w:val="single"/>
-              <w:left w:color="000000" w:space="0" w:sz="6" w:val="single"/>
-              <w:bottom w:color="000000" w:space="0" w:sz="6" w:val="single"/>
-              <w:right w:color="000000" w:space="0" w:sz="6" w:val="single"/>
-            </w:tcBorders>
-            <w:tcMar>
-              <w:top w:w="100.0" w:type="dxa"/>
-              <w:left w:w="100.0" w:type="dxa"/>
-              <w:bottom w:w="100.0" w:type="dxa"/>
-              <w:right w:w="100.0" w:type="dxa"/>
-            </w:tcMar>
-            <w:vAlign w:val="top"/>
-          </w:tcPr>
-          <w:p>
-            <w:pPr>
-              <w:spacing w:after="480" w:lineRule="auto"/>
-              <w:rPr/>
-            </w:pPr>
-            <w:r>
-              <w:rPr>
-                <w:rtl w:val="0"/>
-              </w:rPr>
-              <w:t xml:space="preserve">Not Null</w:t>
-            </w:r>
-          </w:p>
-        </w:tc>
-        <w:tc>
-          <w:tcPr>
-            <w:tcBorders>
-              <w:top w:color="000000" w:space="0" w:sz="6" w:val="single"/>
-              <w:left w:color="000000" w:space="0" w:sz="6" w:val="single"/>
-              <w:bottom w:color="000000" w:space="0" w:sz="6" w:val="single"/>
-              <w:right w:color="000000" w:space="0" w:sz="6" w:val="single"/>
-            </w:tcBorders>
-            <w:tcMar>
-              <w:top w:w="100.0" w:type="dxa"/>
-              <w:left w:w="100.0" w:type="dxa"/>
-              <w:bottom w:w="100.0" w:type="dxa"/>
-              <w:right w:w="100.0" w:type="dxa"/>
-            </w:tcMar>
-            <w:vAlign w:val="top"/>
-          </w:tcPr>
-          <w:p>
-            <w:pPr>
-              <w:spacing w:after="480" w:lineRule="auto"/>
-              <w:rPr/>
-            </w:pPr>
-            <w:r>
-              <w:rPr>
-                <w:rtl w:val="0"/>
-              </w:rPr>
-              <w:t xml:space="preserve">E.g., 30000.00.</w:t>
+            </w:r>
+          </w:p>
+        </w:tc>
+        <w:tc>
+          <w:tcPr>
+            <w:tcBorders>
+              <w:top w:color="000000" w:space="0" w:sz="6" w:val="single"/>
+              <w:left w:color="000000" w:space="0" w:sz="6" w:val="single"/>
+              <w:bottom w:color="000000" w:space="0" w:sz="6" w:val="single"/>
+              <w:right w:color="000000" w:space="0" w:sz="6" w:val="single"/>
+            </w:tcBorders>
+            <w:tcMar>
+              <w:top w:w="100.0" w:type="dxa"/>
+              <w:left w:w="100.0" w:type="dxa"/>
+              <w:bottom w:w="100.0" w:type="dxa"/>
+              <w:right w:w="100.0" w:type="dxa"/>
+            </w:tcMar>
+            <w:vAlign w:val="top"/>
+          </w:tcPr>
+          <w:p>
+            <w:pPr>
+              <w:spacing w:after="480" w:lineRule="auto"/>
+              <w:rPr/>
+            </w:pPr>
+            <w:r>
+              <w:rPr>
+                <w:rtl w:val="0"/>
+              </w:rPr>
+            </w:r>
+          </w:p>
+        </w:tc>
+        <w:tc>
+          <w:tcPr>
+            <w:tcBorders>
+              <w:top w:color="000000" w:space="0" w:sz="6" w:val="single"/>
+              <w:left w:color="000000" w:space="0" w:sz="6" w:val="single"/>
+              <w:bottom w:color="000000" w:space="0" w:sz="6" w:val="single"/>
+              <w:right w:color="000000" w:space="0" w:sz="6" w:val="single"/>
+            </w:tcBorders>
+            <w:tcMar>
+              <w:top w:w="100.0" w:type="dxa"/>
+              <w:left w:w="100.0" w:type="dxa"/>
+              <w:bottom w:w="100.0" w:type="dxa"/>
+              <w:right w:w="100.0" w:type="dxa"/>
+            </w:tcMar>
+            <w:vAlign w:val="top"/>
+          </w:tcPr>
+          <w:p>
+            <w:pPr>
+              <w:spacing w:after="480" w:lineRule="auto"/>
+              <w:rPr/>
+            </w:pPr>
+            <w:r>
+              <w:rPr>
+                <w:rtl w:val="0"/>
+              </w:rPr>
+            </w:r>
+          </w:p>
+        </w:tc>
+        <w:tc>
+          <w:tcPr>
+            <w:tcBorders>
+              <w:top w:color="000000" w:space="0" w:sz="6" w:val="single"/>
+              <w:left w:color="000000" w:space="0" w:sz="6" w:val="single"/>
+              <w:bottom w:color="000000" w:space="0" w:sz="6" w:val="single"/>
+              <w:right w:color="000000" w:space="0" w:sz="6" w:val="single"/>
+            </w:tcBorders>
+            <w:tcMar>
+              <w:top w:w="100.0" w:type="dxa"/>
+              <w:left w:w="100.0" w:type="dxa"/>
+              <w:bottom w:w="100.0" w:type="dxa"/>
+              <w:right w:w="100.0" w:type="dxa"/>
+            </w:tcMar>
+            <w:vAlign w:val="top"/>
+          </w:tcPr>
+          <w:p>
+            <w:pPr>
+              <w:spacing w:after="480" w:lineRule="auto"/>
+              <w:rPr/>
+            </w:pPr>
+            <w:r>
+              <w:rPr>
+                <w:rtl w:val="0"/>
+              </w:rPr>
             </w:r>
           </w:p>
         </w:tc>
@@ -5989,8 +5973,9 @@
     <w:tbl>
       <w:tblPr>
         <w:tblStyle w:val="Table6"/>
-        <w:tblW w:w="9360.0" w:type="dxa"/>
+        <w:tblW w:w="9405.0" w:type="dxa"/>
         <w:jc w:val="left"/>
+        <w:tblInd w:w="-45.0" w:type="dxa"/>
         <w:tblBorders>
           <w:top w:color="000000" w:space="0" w:sz="0" w:val="nil"/>
           <w:left w:color="000000" w:space="0" w:sz="0" w:val="nil"/>
@@ -6003,16 +5988,16 @@
         <w:tblLook w:val="0600"/>
       </w:tblPr>
       <w:tblGrid>
-        <w:gridCol w:w="1749.8067885117493"/>
-        <w:gridCol w:w="1911.1018276762402"/>
-        <w:gridCol w:w="2057.733681462141"/>
-        <w:gridCol w:w="3641.3577023498697"/>
+        <w:gridCol w:w="1800"/>
+        <w:gridCol w:w="1905"/>
+        <w:gridCol w:w="2055"/>
+        <w:gridCol w:w="3645"/>
         <w:tblGridChange w:id="0">
           <w:tblGrid>
-            <w:gridCol w:w="1749.8067885117493"/>
-            <w:gridCol w:w="1911.1018276762402"/>
-            <w:gridCol w:w="2057.733681462141"/>
-            <w:gridCol w:w="3641.3577023498697"/>
+            <w:gridCol w:w="1800"/>
+            <w:gridCol w:w="1905"/>
+            <w:gridCol w:w="2055"/>
+            <w:gridCol w:w="3645"/>
           </w:tblGrid>
         </w:tblGridChange>
       </w:tblGrid>

</xml_diff>